<commit_message>
Manuscript: add section 4.6 Methodological challenges and future work
- Table 7 ranks 12 challenges by measured influence on the decision (one-at-a-time gap
  swings, preferred-option changes, stress tests, EVPPI), with evidence, handling here and
  what would resolve each; PDF and Word versions rebuilt

Co-Authored-By: Claude Opus 5.5 <noreply@anthropic.com>
Claude-Session: https://claude.ai/code/session_01ShvewxXCye9GMG9m7HUFFq
</commit_message>
<xml_diff>
--- a/MSW_pathway_model_v3/docs/MSW_Manuscript_v3_EN.docx
+++ b/MSW_pathway_model_v3/docs/MSW_Manuscript_v3_EN.docx
@@ -8286,7 +8286,7 @@
     </w:p>
     <w:bookmarkEnd w:id="48"/>
     <w:bookmarkEnd w:id="49"/>
-    <w:bookmarkStart w:id="55" w:name="discussion"/>
+    <w:bookmarkStart w:id="56" w:name="discussion"/>
     <w:p>
       <w:pPr>
         <w:pStyle w:val="Heading1"/>
@@ -8488,14 +8488,13 @@
       </w:r>
     </w:p>
     <w:bookmarkEnd w:id="54"/>
-    <w:bookmarkEnd w:id="55"/>
-    <w:bookmarkStart w:id="60" w:name="conclusions"/>
+    <w:bookmarkStart w:id="55" w:name="X7e43eeaf1657a51bceeff03fa6b716777c374c1"/>
     <w:p>
       <w:pPr>
-        <w:pStyle w:val="Heading1"/>
-      </w:pPr>
-      <w:r>
-        <w:t xml:space="preserve">5. Conclusions</w:t>
+        <w:pStyle w:val="Heading2"/>
+      </w:pPr>
+      <w:r>
+        <w:t xml:space="preserve">4.6 Methodological challenges and future work</w:t>
       </w:r>
     </w:p>
     <w:p>
@@ -8504,7 +8503,7 @@
         <w:jc w:val="both"/>
       </w:pPr>
       <w:r>
-        <w:t xml:space="preserve">An ex-ante, provenance-aware screening of six MSW options for 21 Indonesian cities and regencies, made before any of the facilities exists, shows that with equal system boundaries a sanitary landfill with flaring is the least-cost option up to about 50 USD/t CO</w:t>
+        <w:t xml:space="preserve">The limitations above are not equally consequential. Table 7 ranks the methodological challenges of this study by how much they can change the answer to the research question, using the model itself as the yardstick: the one-at-a-time swing of the carbon-inclusive cost gap between RDF + AD and the landfill at 50 USD/t CO</w:t>
       </w:r>
       <w:r>
         <w:rPr>
@@ -8513,35 +8512,1113 @@
         <w:t xml:space="preserve">2</w:t>
       </w:r>
       <w:r>
-        <w:t xml:space="preserve">e, integrated RDF + AD becomes preferable only near 100 USD/t where a cement kiln is accessible and the waste is not too wet, WtE depends on the Perpres 109/2025 tariff and at least 1,000 t/day, AD alone requires source-separated food, and PHB from landfill gas is not competitive. Scenario discovery states these conditions as rules, break-even analysis turns them into targets for tenders and offtake contracts, and the value of information shows that measured as-received waste properties and landfill-gas collection are the data to fund first. Released as an open Colab tool, the model gives local governments, national agencies, offtakers and funders a common, auditable basis for deciding which recovery pathway to pursue before they build.</w:t>
+        <w:t xml:space="preserve">e (base value +8.9 USD/t; negative means RDF + AD is cheaper), the number of locations whose preferred option changes at 100 USD/t, the stress tests (Table 2b) and the value of information (Table 6). The ranking shows that the most consequential challenges are data challenges that local measurement can resolve, rather than structural features of the model.</w:t>
       </w:r>
     </w:p>
-    <w:bookmarkStart w:id="56" w:name="data-and-code-availability"/>
+    <w:tbl>
+      <w:tblPr>
+        <w:tblStyle w:val="Table"/>
+        <w:tblW w:type="pct" w:w="5000"/>
+        <w:tblBorders>
+          <w:top w:val="single" w:sz="4" w:space="0" w:color="A6A6A6"/>
+          <w:left w:val="single" w:sz="4" w:space="0" w:color="A6A6A6"/>
+          <w:bottom w:val="single" w:sz="4" w:space="0" w:color="A6A6A6"/>
+          <w:right w:val="single" w:sz="4" w:space="0" w:color="A6A6A6"/>
+          <w:insideH w:val="single" w:sz="4" w:space="0" w:color="A6A6A6"/>
+          <w:insideV w:val="single" w:sz="4" w:space="0" w:color="A6A6A6"/>
+        </w:tblBorders>
+        <w:tblLayout w:type="fixed"/>
+        <w:tblLook w:firstRow="1" w:lastRow="0" w:firstColumn="0" w:lastColumn="0" w:noHBand="0" w:noVBand="0" w:val="0020"/>
+      </w:tblPr>
+      <w:tblGrid>
+        <w:gridCol w:w="389"/>
+        <w:gridCol w:w="1428"/>
+        <w:gridCol w:w="2207"/>
+        <w:gridCol w:w="1817"/>
+        <w:gridCol w:w="2077"/>
+      </w:tblGrid>
+      <w:tr>
+        <w:trPr>
+          <w:tblHeader w:val="on"/>
+        </w:trPr>
+        <w:tc>
+          <w:tcPr>
+            <w:shd w:val="clear" w:color="auto" w:fill="DCE6F0"/>
+          </w:tcPr>
+          <w:p>
+            <w:pPr>
+              <w:pStyle w:val="Compact"/>
+              <w:spacing w:after="0" w:before="0"/>
+            </w:pPr>
+            <w:r>
+              <w:rPr>
+                <w:b/>
+                <w:sz w:val="16"/>
+              </w:rPr>
+              <w:t xml:space="preserve">#</w:t>
+            </w:r>
+          </w:p>
+        </w:tc>
+        <w:tc>
+          <w:tcPr>
+            <w:shd w:val="clear" w:color="auto" w:fill="DCE6F0"/>
+          </w:tcPr>
+          <w:p>
+            <w:pPr>
+              <w:pStyle w:val="Compact"/>
+              <w:spacing w:after="0" w:before="0"/>
+            </w:pPr>
+            <w:r>
+              <w:rPr>
+                <w:b/>
+                <w:sz w:val="16"/>
+              </w:rPr>
+              <w:t xml:space="preserve">Challenge</w:t>
+            </w:r>
+          </w:p>
+        </w:tc>
+        <w:tc>
+          <w:tcPr>
+            <w:shd w:val="clear" w:color="auto" w:fill="DCE6F0"/>
+          </w:tcPr>
+          <w:p>
+            <w:pPr>
+              <w:pStyle w:val="Compact"/>
+              <w:spacing w:after="0" w:before="0"/>
+            </w:pPr>
+            <w:r>
+              <w:rPr>
+                <w:b/>
+                <w:sz w:val="16"/>
+              </w:rPr>
+              <w:t xml:space="preserve">Evidence from this study</w:t>
+            </w:r>
+          </w:p>
+        </w:tc>
+        <w:tc>
+          <w:tcPr>
+            <w:shd w:val="clear" w:color="auto" w:fill="DCE6F0"/>
+          </w:tcPr>
+          <w:p>
+            <w:pPr>
+              <w:pStyle w:val="Compact"/>
+              <w:spacing w:after="0" w:before="0"/>
+            </w:pPr>
+            <w:r>
+              <w:rPr>
+                <w:b/>
+                <w:sz w:val="16"/>
+              </w:rPr>
+              <w:t xml:space="preserve">How it was handled here</w:t>
+            </w:r>
+          </w:p>
+        </w:tc>
+        <w:tc>
+          <w:tcPr>
+            <w:shd w:val="clear" w:color="auto" w:fill="DCE6F0"/>
+          </w:tcPr>
+          <w:p>
+            <w:pPr>
+              <w:pStyle w:val="Compact"/>
+              <w:spacing w:after="0" w:before="0"/>
+            </w:pPr>
+            <w:r>
+              <w:rPr>
+                <w:b/>
+                <w:sz w:val="16"/>
+              </w:rPr>
+              <w:t xml:space="preserve">What would resolve it</w:t>
+            </w:r>
+          </w:p>
+        </w:tc>
+      </w:tr>
+      <w:tr>
+        <w:tc>
+          <w:tcPr/>
+          <w:p>
+            <w:pPr>
+              <w:pStyle w:val="Compact"/>
+              <w:spacing w:after="0" w:before="0"/>
+            </w:pPr>
+            <w:r>
+              <w:rPr>
+                <w:sz w:val="16"/>
+              </w:rPr>
+              <w:t xml:space="preserve">1</w:t>
+            </w:r>
+          </w:p>
+        </w:tc>
+        <w:tc>
+          <w:tcPr/>
+          <w:p>
+            <w:pPr>
+              <w:pStyle w:val="Compact"/>
+              <w:spacing w:after="0" w:before="0"/>
+            </w:pPr>
+            <w:r>
+              <w:rPr>
+                <w:sz w:val="16"/>
+              </w:rPr>
+              <w:t xml:space="preserve">Landfill-gas collection efficiency is not measured at any study site</w:t>
+            </w:r>
+          </w:p>
+        </w:tc>
+        <w:tc>
+          <w:tcPr/>
+          <w:p>
+            <w:pPr>
+              <w:pStyle w:val="Compact"/>
+              <w:spacing w:after="0" w:before="0"/>
+            </w:pPr>
+            <w:r>
+              <w:rPr>
+                <w:sz w:val="16"/>
+              </w:rPr>
+              <w:t xml:space="preserve">Gap -1.3 to +18.8 USD/t over its range (0.20–0.80); preferred option changes in up to 20 locations at 100 USD/t; second-largest group EVPPI (0.65 USD/t at 100 USD/t)</w:t>
+            </w:r>
+          </w:p>
+        </w:tc>
+        <w:tc>
+          <w:tcPr/>
+          <w:p>
+            <w:pPr>
+              <w:pStyle w:val="Compact"/>
+              <w:spacing w:after="0" w:before="0"/>
+            </w:pPr>
+            <w:r>
+              <w:rPr>
+                <w:sz w:val="16"/>
+              </w:rPr>
+              <w:t xml:space="preserve">Wide range from the literature; scenario and VOI analysis</w:t>
+            </w:r>
+          </w:p>
+        </w:tc>
+        <w:tc>
+          <w:tcPr/>
+          <w:p>
+            <w:pPr>
+              <w:pStyle w:val="Compact"/>
+              <w:spacing w:after="0" w:before="0"/>
+            </w:pPr>
+            <w:r>
+              <w:rPr>
+                <w:sz w:val="16"/>
+              </w:rPr>
+              <w:t xml:space="preserve">Pumping tests or flux measurements at operating sanitary landfills (priority 1)</w:t>
+            </w:r>
+          </w:p>
+        </w:tc>
+      </w:tr>
+      <w:tr>
+        <w:tc>
+          <w:tcPr/>
+          <w:p>
+            <w:pPr>
+              <w:pStyle w:val="Compact"/>
+              <w:spacing w:after="0" w:before="0"/>
+            </w:pPr>
+            <w:r>
+              <w:rPr>
+                <w:sz w:val="16"/>
+              </w:rPr>
+              <w:t xml:space="preserve">2</w:t>
+            </w:r>
+          </w:p>
+        </w:tc>
+        <w:tc>
+          <w:tcPr/>
+          <w:p>
+            <w:pPr>
+              <w:pStyle w:val="Compact"/>
+              <w:spacing w:after="0" w:before="0"/>
+            </w:pPr>
+            <w:r>
+              <w:rPr>
+                <w:sz w:val="16"/>
+              </w:rPr>
+              <w:t xml:space="preserve">Moisture and heating value of waste as received are not measured locally</w:t>
+            </w:r>
+          </w:p>
+        </w:tc>
+        <w:tc>
+          <w:tcPr/>
+          <w:p>
+            <w:pPr>
+              <w:pStyle w:val="Compact"/>
+              <w:spacing w:after="0" w:before="0"/>
+            </w:pPr>
+            <w:r>
+              <w:rPr>
+                <w:sz w:val="16"/>
+              </w:rPr>
+              <w:t xml:space="preserve">Gap -1.4 to +16.4 USD/t between moisture bounds; upper bound returns 17 of 21 locations to the landfill at 100 USD/t; largest group EVPPI (0.77 USD/t)</w:t>
+            </w:r>
+          </w:p>
+        </w:tc>
+        <w:tc>
+          <w:tcPr/>
+          <w:p>
+            <w:pPr>
+              <w:pStyle w:val="Compact"/>
+              <w:spacing w:after="0" w:before="0"/>
+            </w:pPr>
+            <w:r>
+              <w:rPr>
+                <w:sz w:val="16"/>
+              </w:rPr>
+              <w:t xml:space="preserve">Calibrated assumption, common wetness draw, IPCC and high-bound scenarios</w:t>
+            </w:r>
+          </w:p>
+        </w:tc>
+        <w:tc>
+          <w:tcPr/>
+          <w:p>
+            <w:pPr>
+              <w:pStyle w:val="Compact"/>
+              <w:spacing w:after="0" w:before="0"/>
+            </w:pPr>
+            <w:r>
+              <w:rPr>
+                <w:sz w:val="16"/>
+              </w:rPr>
+              <w:t xml:space="preserve">Waste characterisation with proximate analysis at the facility gate, wet and dry season (priority 1)</w:t>
+            </w:r>
+          </w:p>
+        </w:tc>
+      </w:tr>
+      <w:tr>
+        <w:tc>
+          <w:tcPr/>
+          <w:p>
+            <w:pPr>
+              <w:pStyle w:val="Compact"/>
+              <w:spacing w:after="0" w:before="0"/>
+            </w:pPr>
+            <w:r>
+              <w:rPr>
+                <w:sz w:val="16"/>
+              </w:rPr>
+              <w:t xml:space="preserve">3</w:t>
+            </w:r>
+          </w:p>
+        </w:tc>
+        <w:tc>
+          <w:tcPr/>
+          <w:p>
+            <w:pPr>
+              <w:pStyle w:val="Compact"/>
+              <w:spacing w:after="0" w:before="0"/>
+            </w:pPr>
+            <w:r>
+              <w:rPr>
+                <w:sz w:val="16"/>
+              </w:rPr>
+              <w:t xml:space="preserve">Composition is a sampling-year proxy with inconsistent categories and no replicates</w:t>
+            </w:r>
+          </w:p>
+        </w:tc>
+        <w:tc>
+          <w:tcPr/>
+          <w:p>
+            <w:pPr>
+              <w:pStyle w:val="Compact"/>
+              <w:spacing w:after="0" w:before="0"/>
+            </w:pPr>
+            <w:r>
+              <w:rPr>
+                <w:sz w:val="16"/>
+              </w:rPr>
+              <w:t xml:space="preserve">Sampling years 2014–2025; lumped organics and missing glass in some RIPS; Dirichlet concentration is heuristic</w:t>
+            </w:r>
+          </w:p>
+        </w:tc>
+        <w:tc>
+          <w:tcPr/>
+          <w:p>
+            <w:pPr>
+              <w:pStyle w:val="Compact"/>
+              <w:spacing w:after="0" w:before="0"/>
+            </w:pPr>
+            <w:r>
+              <w:rPr>
+                <w:sz w:val="16"/>
+              </w:rPr>
+              <w:t xml:space="preserve">Provenance labels, harmonisation rules L/W, glass imputation and pseudocount scenarios (at most 2 changes)</w:t>
+            </w:r>
+          </w:p>
+        </w:tc>
+        <w:tc>
+          <w:tcPr/>
+          <w:p>
+            <w:pPr>
+              <w:pStyle w:val="Compact"/>
+              <w:spacing w:after="0" w:before="0"/>
+            </w:pPr>
+            <w:r>
+              <w:rPr>
+                <w:sz w:val="16"/>
+              </w:rPr>
+              <w:t xml:space="preserve">Standardised sorting campaigns (SNI 19-3964-1994) with replicates to calibrate the concentration</w:t>
+            </w:r>
+          </w:p>
+        </w:tc>
+      </w:tr>
+      <w:tr>
+        <w:tc>
+          <w:tcPr/>
+          <w:p>
+            <w:pPr>
+              <w:pStyle w:val="Compact"/>
+              <w:spacing w:after="0" w:before="0"/>
+            </w:pPr>
+            <w:r>
+              <w:rPr>
+                <w:sz w:val="16"/>
+              </w:rPr>
+              <w:t xml:space="preserve">4</w:t>
+            </w:r>
+          </w:p>
+        </w:tc>
+        <w:tc>
+          <w:tcPr/>
+          <w:p>
+            <w:pPr>
+              <w:pStyle w:val="Compact"/>
+              <w:spacing w:after="0" w:before="0"/>
+            </w:pPr>
+            <w:r>
+              <w:rPr>
+                <w:sz w:val="16"/>
+              </w:rPr>
+              <w:t xml:space="preserve">Secondary data verified only at abstract level; RIPS source files not re-checked</w:t>
+            </w:r>
+          </w:p>
+        </w:tc>
+        <w:tc>
+          <w:tcPr/>
+          <w:p>
+            <w:pPr>
+              <w:pStyle w:val="Compact"/>
+              <w:spacing w:after="0" w:before="0"/>
+            </w:pPr>
+            <w:r>
+              <w:rPr>
+                <w:sz w:val="16"/>
+              </w:rPr>
+              <w:t xml:space="preserve">4 of 61 register values confirmed (status V); 36 literature values still status L; 23 items re-checked, 5 corrected</w:t>
+            </w:r>
+          </w:p>
+        </w:tc>
+        <w:tc>
+          <w:tcPr/>
+          <w:p>
+            <w:pPr>
+              <w:pStyle w:val="Compact"/>
+              <w:spacing w:after="0" w:before="0"/>
+            </w:pPr>
+            <w:r>
+              <w:rPr>
+                <w:sz w:val="16"/>
+              </w:rPr>
+              <w:t xml:space="preserve">Item-level verification file with evidence and method; corrected values used</w:t>
+            </w:r>
+          </w:p>
+        </w:tc>
+        <w:tc>
+          <w:tcPr/>
+          <w:p>
+            <w:pPr>
+              <w:pStyle w:val="Compact"/>
+              <w:spacing w:after="0" w:before="0"/>
+            </w:pPr>
+            <w:r>
+              <w:rPr>
+                <w:sz w:val="16"/>
+              </w:rPr>
+              <w:t xml:space="preserve">Full-text check of every status L value and of the RIPS tables before publication</w:t>
+            </w:r>
+          </w:p>
+        </w:tc>
+      </w:tr>
+      <w:tr>
+        <w:tc>
+          <w:tcPr/>
+          <w:p>
+            <w:pPr>
+              <w:pStyle w:val="Compact"/>
+              <w:spacing w:after="0" w:before="0"/>
+            </w:pPr>
+            <w:r>
+              <w:rPr>
+                <w:sz w:val="16"/>
+              </w:rPr>
+              <w:t xml:space="preserve">5</w:t>
+            </w:r>
+          </w:p>
+        </w:tc>
+        <w:tc>
+          <w:tcPr/>
+          <w:p>
+            <w:pPr>
+              <w:pStyle w:val="Compact"/>
+              <w:spacing w:after="0" w:before="0"/>
+            </w:pPr>
+            <w:r>
+              <w:rPr>
+                <w:sz w:val="16"/>
+              </w:rPr>
+              <w:t xml:space="preserve">Plant costs are class-5 estimates with few Indonesian data points</w:t>
+            </w:r>
+          </w:p>
+        </w:tc>
+        <w:tc>
+          <w:tcPr/>
+          <w:p>
+            <w:pPr>
+              <w:pStyle w:val="Compact"/>
+              <w:spacing w:after="0" w:before="0"/>
+            </w:pPr>
+            <w:r>
+              <w:rPr>
+                <w:sz w:val="16"/>
+              </w:rPr>
+              <w:t xml:space="preserve">RDF O&amp;M: gap +2.5 to +15.0 USD/t; AD CAPEX: +6.6 to +14.8 USD/t, against a base gap of 8.9 USD/t</w:t>
+            </w:r>
+          </w:p>
+        </w:tc>
+        <w:tc>
+          <w:tcPr/>
+          <w:p>
+            <w:pPr>
+              <w:pStyle w:val="Compact"/>
+              <w:spacing w:after="0" w:before="0"/>
+            </w:pPr>
+            <w:r>
+              <w:rPr>
+                <w:sz w:val="16"/>
+              </w:rPr>
+              <w:t xml:space="preserve">Wide triangular ranges, Monte Carlo, break-even targets</w:t>
+            </w:r>
+          </w:p>
+        </w:tc>
+        <w:tc>
+          <w:tcPr/>
+          <w:p>
+            <w:pPr>
+              <w:pStyle w:val="Compact"/>
+              <w:spacing w:after="0" w:before="0"/>
+            </w:pPr>
+            <w:r>
+              <w:rPr>
+                <w:sz w:val="16"/>
+              </w:rPr>
+              <w:t xml:space="preserve">Cost data from Indonesian RDF, AD and WtE projects and tenders</w:t>
+            </w:r>
+          </w:p>
+        </w:tc>
+      </w:tr>
+      <w:tr>
+        <w:tc>
+          <w:tcPr/>
+          <w:p>
+            <w:pPr>
+              <w:pStyle w:val="Compact"/>
+              <w:spacing w:after="0" w:before="0"/>
+            </w:pPr>
+            <w:r>
+              <w:rPr>
+                <w:sz w:val="16"/>
+              </w:rPr>
+              <w:t xml:space="preserve">6</w:t>
+            </w:r>
+          </w:p>
+        </w:tc>
+        <w:tc>
+          <w:tcPr/>
+          <w:p>
+            <w:pPr>
+              <w:pStyle w:val="Compact"/>
+              <w:spacing w:after="0" w:before="0"/>
+            </w:pPr>
+            <w:r>
+              <w:rPr>
+                <w:sz w:val="16"/>
+              </w:rPr>
+              <w:t xml:space="preserve">No facility exists, so outcomes cannot be validated</w:t>
+            </w:r>
+          </w:p>
+        </w:tc>
+        <w:tc>
+          <w:tcPr/>
+          <w:p>
+            <w:pPr>
+              <w:pStyle w:val="Compact"/>
+              <w:spacing w:after="0" w:before="0"/>
+            </w:pPr>
+            <w:r>
+              <w:rPr>
+                <w:sz w:val="16"/>
+              </w:rPr>
+              <w:t xml:space="preserve">Validation limited to verification, benchmarks of intermediate quantities and stress tests</w:t>
+            </w:r>
+          </w:p>
+        </w:tc>
+        <w:tc>
+          <w:tcPr/>
+          <w:p>
+            <w:pPr>
+              <w:pStyle w:val="Compact"/>
+              <w:spacing w:after="0" w:before="0"/>
+            </w:pPr>
+            <w:r>
+              <w:rPr>
+                <w:sz w:val="16"/>
+              </w:rPr>
+              <w:t xml:space="preserve">Four validation layers; framing as ex-ante decision support</w:t>
+            </w:r>
+          </w:p>
+        </w:tc>
+        <w:tc>
+          <w:tcPr/>
+          <w:p>
+            <w:pPr>
+              <w:pStyle w:val="Compact"/>
+              <w:spacing w:after="0" w:before="0"/>
+            </w:pPr>
+            <w:r>
+              <w:rPr>
+                <w:sz w:val="16"/>
+              </w:rPr>
+              <w:t xml:space="preserve">Monitoring of pilot plants and re-running the model with their data</w:t>
+            </w:r>
+          </w:p>
+        </w:tc>
+      </w:tr>
+      <w:tr>
+        <w:tc>
+          <w:tcPr/>
+          <w:p>
+            <w:pPr>
+              <w:pStyle w:val="Compact"/>
+              <w:spacing w:after="0" w:before="0"/>
+            </w:pPr>
+            <w:r>
+              <w:rPr>
+                <w:sz w:val="16"/>
+              </w:rPr>
+              <w:t xml:space="preserve">7</w:t>
+            </w:r>
+          </w:p>
+        </w:tc>
+        <w:tc>
+          <w:tcPr/>
+          <w:p>
+            <w:pPr>
+              <w:pStyle w:val="Compact"/>
+              <w:spacing w:after="0" w:before="0"/>
+            </w:pPr>
+            <w:r>
+              <w:rPr>
+                <w:sz w:val="16"/>
+              </w:rPr>
+              <w:t xml:space="preserve">Static per-tonne inventory</w:t>
+            </w:r>
+          </w:p>
+        </w:tc>
+        <w:tc>
+          <w:tcPr/>
+          <w:p>
+            <w:pPr>
+              <w:pStyle w:val="Compact"/>
+              <w:spacing w:after="0" w:before="0"/>
+            </w:pPr>
+            <w:r>
+              <w:rPr>
+                <w:sz w:val="16"/>
+              </w:rPr>
+              <w:t xml:space="preserve">No first-order decay of landfill gas; no kiln decarbonisation; grid credit evaluated at one year</w:t>
+            </w:r>
+          </w:p>
+        </w:tc>
+        <w:tc>
+          <w:tcPr/>
+          <w:p>
+            <w:pPr>
+              <w:pStyle w:val="Compact"/>
+              <w:spacing w:after="0" w:before="0"/>
+            </w:pPr>
+            <w:r>
+              <w:rPr>
+                <w:sz w:val="16"/>
+              </w:rPr>
+              <w:t xml:space="preserve">2045 projection with grid path and escalation</w:t>
+            </w:r>
+          </w:p>
+        </w:tc>
+        <w:tc>
+          <w:tcPr/>
+          <w:p>
+            <w:pPr>
+              <w:pStyle w:val="Compact"/>
+              <w:spacing w:after="0" w:before="0"/>
+            </w:pPr>
+            <w:r>
+              <w:rPr>
+                <w:sz w:val="16"/>
+              </w:rPr>
+              <w:t xml:space="preserve">Time-resolved landfill model and lifetime-averaged grid credits</w:t>
+            </w:r>
+          </w:p>
+        </w:tc>
+      </w:tr>
+      <w:tr>
+        <w:tc>
+          <w:tcPr/>
+          <w:p>
+            <w:pPr>
+              <w:pStyle w:val="Compact"/>
+              <w:spacing w:after="0" w:before="0"/>
+            </w:pPr>
+            <w:r>
+              <w:rPr>
+                <w:sz w:val="16"/>
+              </w:rPr>
+              <w:t xml:space="preserve">8</w:t>
+            </w:r>
+          </w:p>
+        </w:tc>
+        <w:tc>
+          <w:tcPr/>
+          <w:p>
+            <w:pPr>
+              <w:pStyle w:val="Compact"/>
+              <w:spacing w:after="0" w:before="0"/>
+            </w:pPr>
+            <w:r>
+              <w:rPr>
+                <w:sz w:val="16"/>
+              </w:rPr>
+              <w:t xml:space="preserve">Inputs sampled independently</w:t>
+            </w:r>
+          </w:p>
+        </w:tc>
+        <w:tc>
+          <w:tcPr/>
+          <w:p>
+            <w:pPr>
+              <w:pStyle w:val="Compact"/>
+              <w:spacing w:after="0" w:before="0"/>
+            </w:pPr>
+            <w:r>
+              <w:rPr>
+                <w:sz w:val="16"/>
+              </w:rPr>
+              <w:t xml:space="preserve">Moisture, heating value and DOC are linked physically; costs co-vary</w:t>
+            </w:r>
+          </w:p>
+        </w:tc>
+        <w:tc>
+          <w:tcPr/>
+          <w:p>
+            <w:pPr>
+              <w:pStyle w:val="Compact"/>
+              <w:spacing w:after="0" w:before="0"/>
+            </w:pPr>
+            <w:r>
+              <w:rPr>
+                <w:sz w:val="16"/>
+              </w:rPr>
+              <w:t xml:space="preserve">One common wetness draw for all fractions</w:t>
+            </w:r>
+          </w:p>
+        </w:tc>
+        <w:tc>
+          <w:tcPr/>
+          <w:p>
+            <w:pPr>
+              <w:pStyle w:val="Compact"/>
+              <w:spacing w:after="0" w:before="0"/>
+            </w:pPr>
+            <w:r>
+              <w:rPr>
+                <w:sz w:val="16"/>
+              </w:rPr>
+              <w:t xml:space="preserve">Correlated sampling (e.g. copulas) for moisture-LHV-DOC and for costs</w:t>
+            </w:r>
+          </w:p>
+        </w:tc>
+      </w:tr>
+      <w:tr>
+        <w:tc>
+          <w:tcPr/>
+          <w:p>
+            <w:pPr>
+              <w:pStyle w:val="Compact"/>
+              <w:spacing w:after="0" w:before="0"/>
+            </w:pPr>
+            <w:r>
+              <w:rPr>
+                <w:sz w:val="16"/>
+              </w:rPr>
+              <w:t xml:space="preserve">9</w:t>
+            </w:r>
+          </w:p>
+        </w:tc>
+        <w:tc>
+          <w:tcPr/>
+          <w:p>
+            <w:pPr>
+              <w:pStyle w:val="Compact"/>
+              <w:spacing w:after="0" w:before="0"/>
+            </w:pPr>
+            <w:r>
+              <w:rPr>
+                <w:sz w:val="16"/>
+              </w:rPr>
+              <w:t xml:space="preserve">Single valued impact in the decision</w:t>
+            </w:r>
+          </w:p>
+        </w:tc>
+        <w:tc>
+          <w:tcPr/>
+          <w:p>
+            <w:pPr>
+              <w:pStyle w:val="Compact"/>
+              <w:spacing w:after="0" w:before="0"/>
+            </w:pPr>
+            <w:r>
+              <w:rPr>
+                <w:sz w:val="16"/>
+              </w:rPr>
+              <w:t xml:space="preserve">Carbon-inclusive cost values only GHG; air pollution, health, leachate, jobs and acceptance excluded</w:t>
+            </w:r>
+          </w:p>
+        </w:tc>
+        <w:tc>
+          <w:tcPr/>
+          <w:p>
+            <w:pPr>
+              <w:pStyle w:val="Compact"/>
+              <w:spacing w:after="0" w:before="0"/>
+            </w:pPr>
+            <w:r>
+              <w:rPr>
+                <w:sz w:val="16"/>
+              </w:rPr>
+              <w:t xml:space="preserve">CED and land take reported; limits stated</w:t>
+            </w:r>
+          </w:p>
+        </w:tc>
+        <w:tc>
+          <w:tcPr/>
+          <w:p>
+            <w:pPr>
+              <w:pStyle w:val="Compact"/>
+              <w:spacing w:after="0" w:before="0"/>
+            </w:pPr>
+            <w:r>
+              <w:rPr>
+                <w:sz w:val="16"/>
+              </w:rPr>
+              <w:t xml:space="preserve">Multi-criteria extension with local air-quality and social indicators</w:t>
+            </w:r>
+          </w:p>
+        </w:tc>
+      </w:tr>
+      <w:tr>
+        <w:tc>
+          <w:tcPr/>
+          <w:p>
+            <w:pPr>
+              <w:pStyle w:val="Compact"/>
+              <w:spacing w:after="0" w:before="0"/>
+            </w:pPr>
+            <w:r>
+              <w:rPr>
+                <w:sz w:val="16"/>
+              </w:rPr>
+              <w:t xml:space="preserve">10</w:t>
+            </w:r>
+          </w:p>
+        </w:tc>
+        <w:tc>
+          <w:tcPr/>
+          <w:p>
+            <w:pPr>
+              <w:pStyle w:val="Compact"/>
+              <w:spacing w:after="0" w:before="0"/>
+            </w:pPr>
+            <w:r>
+              <w:rPr>
+                <w:sz w:val="16"/>
+              </w:rPr>
+              <w:t xml:space="preserve">Decision depends on a policy carbon value and hard feasibility thresholds</w:t>
+            </w:r>
+          </w:p>
+        </w:tc>
+        <w:tc>
+          <w:tcPr/>
+          <w:p>
+            <w:pPr>
+              <w:pStyle w:val="Compact"/>
+              <w:spacing w:after="0" w:before="0"/>
+            </w:pPr>
+            <w:r>
+              <w:rPr>
+                <w:sz w:val="16"/>
+              </w:rPr>
+              <w:t xml:space="preserve">Landfill preferred up to 50 USD/t, RDF + AD near 100 USD/t; result at 100 USD/t fragile (stress tests change 17 of 21)</w:t>
+            </w:r>
+          </w:p>
+        </w:tc>
+        <w:tc>
+          <w:tcPr/>
+          <w:p>
+            <w:pPr>
+              <w:pStyle w:val="Compact"/>
+              <w:spacing w:after="0" w:before="0"/>
+            </w:pPr>
+            <w:r>
+              <w:rPr>
+                <w:sz w:val="16"/>
+              </w:rPr>
+              <w:t xml:space="preserve">Fixed carbon values with standard errors; stress tests</w:t>
+            </w:r>
+          </w:p>
+        </w:tc>
+        <w:tc>
+          <w:tcPr/>
+          <w:p>
+            <w:pPr>
+              <w:pStyle w:val="Compact"/>
+              <w:spacing w:after="0" w:before="0"/>
+            </w:pPr>
+            <w:r>
+              <w:rPr>
+                <w:sz w:val="16"/>
+              </w:rPr>
+              <w:t xml:space="preserve">Explicit policy scenarios for carbon price and tariff trajectories</w:t>
+            </w:r>
+          </w:p>
+        </w:tc>
+      </w:tr>
+      <w:tr>
+        <w:tc>
+          <w:tcPr/>
+          <w:p>
+            <w:pPr>
+              <w:pStyle w:val="Compact"/>
+              <w:spacing w:after="0" w:before="0"/>
+            </w:pPr>
+            <w:r>
+              <w:rPr>
+                <w:sz w:val="16"/>
+              </w:rPr>
+              <w:t xml:space="preserve">11</w:t>
+            </w:r>
+          </w:p>
+        </w:tc>
+        <w:tc>
+          <w:tcPr/>
+          <w:p>
+            <w:pPr>
+              <w:pStyle w:val="Compact"/>
+              <w:spacing w:after="0" w:before="0"/>
+            </w:pPr>
+            <w:r>
+              <w:rPr>
+                <w:sz w:val="16"/>
+              </w:rPr>
+              <w:t xml:space="preserve">Decision rules approximate the model</w:t>
+            </w:r>
+          </w:p>
+        </w:tc>
+        <w:tc>
+          <w:tcPr/>
+          <w:p>
+            <w:pPr>
+              <w:pStyle w:val="Compact"/>
+              <w:spacing w:after="0" w:before="0"/>
+            </w:pPr>
+            <w:r>
+              <w:rPr>
+                <w:sz w:val="16"/>
+              </w:rPr>
+              <w:t xml:space="preserve">Tree accuracy 78%; PRIM density for RDF + AD 0.42; valid within the observed composition range</w:t>
+            </w:r>
+          </w:p>
+        </w:tc>
+        <w:tc>
+          <w:tcPr/>
+          <w:p>
+            <w:pPr>
+              <w:pStyle w:val="Compact"/>
+              <w:spacing w:after="0" w:before="0"/>
+            </w:pPr>
+            <w:r>
+              <w:rPr>
+                <w:sz w:val="16"/>
+              </w:rPr>
+              <w:t xml:space="preserve">Rules reported with purity, coverage and density</w:t>
+            </w:r>
+          </w:p>
+        </w:tc>
+        <w:tc>
+          <w:tcPr/>
+          <w:p>
+            <w:pPr>
+              <w:pStyle w:val="Compact"/>
+              <w:spacing w:after="0" w:before="0"/>
+            </w:pPr>
+            <w:r>
+              <w:rPr>
+                <w:sz w:val="16"/>
+              </w:rPr>
+              <w:t xml:space="preserve">More locations, especially outside Java, to widen the condition space</w:t>
+            </w:r>
+          </w:p>
+        </w:tc>
+      </w:tr>
+      <w:tr>
+        <w:tc>
+          <w:tcPr/>
+          <w:p>
+            <w:pPr>
+              <w:pStyle w:val="Compact"/>
+              <w:spacing w:after="0" w:before="0"/>
+            </w:pPr>
+            <w:r>
+              <w:rPr>
+                <w:sz w:val="16"/>
+              </w:rPr>
+              <w:t xml:space="preserve">12</w:t>
+            </w:r>
+          </w:p>
+        </w:tc>
+        <w:tc>
+          <w:tcPr/>
+          <w:p>
+            <w:pPr>
+              <w:pStyle w:val="Compact"/>
+              <w:spacing w:after="0" w:before="0"/>
+            </w:pPr>
+            <w:r>
+              <w:rPr>
+                <w:sz w:val="16"/>
+              </w:rPr>
+              <w:t xml:space="preserve">Limited regional coverage</w:t>
+            </w:r>
+          </w:p>
+        </w:tc>
+        <w:tc>
+          <w:tcPr/>
+          <w:p>
+            <w:pPr>
+              <w:pStyle w:val="Compact"/>
+              <w:spacing w:after="0" w:before="0"/>
+            </w:pPr>
+            <w:r>
+              <w:rPr>
+                <w:sz w:val="16"/>
+              </w:rPr>
+              <w:t xml:space="preserve">12 of 21 locations in Central Java; one each in Sumatra, Kalimantan and Bali</w:t>
+            </w:r>
+          </w:p>
+        </w:tc>
+        <w:tc>
+          <w:tcPr/>
+          <w:p>
+            <w:pPr>
+              <w:pStyle w:val="Compact"/>
+              <w:spacing w:after="0" w:before="0"/>
+            </w:pPr>
+            <w:r>
+              <w:rPr>
+                <w:sz w:val="16"/>
+              </w:rPr>
+              <w:t xml:space="preserve">One-city tool and template for new locations</w:t>
+            </w:r>
+          </w:p>
+        </w:tc>
+        <w:tc>
+          <w:tcPr/>
+          <w:p>
+            <w:pPr>
+              <w:pStyle w:val="Compact"/>
+              <w:spacing w:after="0" w:before="0"/>
+            </w:pPr>
+            <w:r>
+              <w:rPr>
+                <w:sz w:val="16"/>
+              </w:rPr>
+              <w:t xml:space="preserve">Applying the tool to cities in Sumatra, Kalimantan, Sulawesi and eastern Indonesia</w:t>
+            </w:r>
+          </w:p>
+        </w:tc>
+      </w:tr>
+    </w:tbl>
     <w:p>
       <w:pPr>
-        <w:pStyle w:val="Heading2"/>
-      </w:pPr>
-      <w:r>
-        <w:t xml:space="preserve">Data and code availability</w:t>
+        <w:pStyle w:val="Caption"/>
+      </w:pPr>
+      <w:r>
+        <w:t xml:space="preserve">Table 7. Methodological challenges ranked by their measured influence on the decision (one-at-a-time ranges from outputs/parameter_influence.csv; group EVPPI at 100 USD/t CO</w:t>
+      </w:r>
+      <w:r>
+        <w:rPr>
+          <w:vertAlign w:val="subscript"/>
+        </w:rPr>
+        <w:t xml:space="preserve">2</w:t>
+      </w:r>
+      <w:r>
+        <w:t xml:space="preserve">e from Table 6).</w:t>
       </w:r>
     </w:p>
     <w:p>
       <w:pPr>
+        <w:pStyle w:val="BodyText"/>
+        <w:jc w:val="both"/>
+      </w:pPr>
+      <w:r>
+        <w:t xml:space="preserve">Future work should therefore proceed in the order of Table 7. The first two items, landfill-gas collection and the properties of waste as received, carry most of the value of information and are field measurements rather than model developments; a city should commission them whenever their cost is below the corresponding EVPPI per year. Full-text verification of the remaining literature values (item 4) is a precondition for publication. Correlated sampling, a time-resolved landfill model and multi-criteria extension (items 7–9) are model developments that matter mainly for the high-carbon-value results. Applying the released one-city tool to new regions (item 12) is the most direct way to test whether the decision rules hold beyond Java.</w:t>
+      </w:r>
+    </w:p>
+    <w:bookmarkEnd w:id="55"/>
+    <w:bookmarkEnd w:id="56"/>
+    <w:bookmarkStart w:id="61" w:name="conclusions"/>
+    <w:p>
+      <w:pPr>
+        <w:pStyle w:val="Heading1"/>
+      </w:pPr>
+      <w:r>
+        <w:t xml:space="preserve">5. Conclusions</w:t>
+      </w:r>
+    </w:p>
+    <w:p>
+      <w:pPr>
         <w:pStyle w:val="FirstParagraph"/>
         <w:jc w:val="both"/>
       </w:pPr>
       <w:r>
-        <w:t xml:space="preserve">The database, model, notebook, validation suite and the scripts that generate this manuscript are provided in the MSW_pathway_model_v3 package (build_database_v3.py, msw_pathway_model_v3.py, MSW_pathway_model_v3.ipynb, validate_v3.py). Row-level RIPS source locators are given in input_kota_2025_updated.csv. The package mswpath and the notebook MSW_Decision_Tool_Colab.ipynb let other researchers and planners run the model in Google Colab for their own cities from a one-row-per-city template, re-run the scenario discovery and download Excel/HTML reports in English or Indonesian. A one-city notebook, MSW_Single_City_Colab.ipynb, with an input template in XLSX and CSV form (templates/single_city_template.xlsx), lets readers enter the data of one city by hand, including their own measured parameter values, and reproduces every result of this article for that city; with the example data it reproduces the Kota Padang worked example.</w:t>
+        <w:t xml:space="preserve">An ex-ante, provenance-aware screening of six MSW options for 21 Indonesian cities and regencies, made before any of the facilities exists, shows that with equal system boundaries a sanitary landfill with flaring is the least-cost option up to about 50 USD/t CO</w:t>
+      </w:r>
+      <w:r>
+        <w:rPr>
+          <w:vertAlign w:val="subscript"/>
+        </w:rPr>
+        <w:t xml:space="preserve">2</w:t>
+      </w:r>
+      <w:r>
+        <w:t xml:space="preserve">e, integrated RDF + AD becomes preferable only near 100 USD/t where a cement kiln is accessible and the waste is not too wet, WtE depends on the Perpres 109/2025 tariff and at least 1,000 t/day, AD alone requires source-separated food, and PHB from landfill gas is not competitive. Scenario discovery states these conditions as rules, break-even analysis turns them into targets for tenders and offtake contracts, and the value of information shows that measured as-received waste properties and landfill-gas collection are the data to fund first. Released as an open Colab tool, the model gives local governments, national agencies, offtakers and funders a common, auditable basis for deciding which recovery pathway to pursue before they build.</w:t>
       </w:r>
     </w:p>
-    <w:bookmarkEnd w:id="56"/>
-    <w:bookmarkStart w:id="57" w:name="X1a4b0110e6e310c17b3aabed2f99a69911f4168"/>
+    <w:bookmarkStart w:id="57" w:name="data-and-code-availability"/>
     <w:p>
       <w:pPr>
         <w:pStyle w:val="Heading2"/>
       </w:pPr>
       <w:r>
-        <w:t xml:space="preserve">CRediT authorship contribution statement (draft)</w:t>
+        <w:t xml:space="preserve">Data and code availability</w:t>
       </w:r>
     </w:p>
     <w:p>
@@ -8550,17 +9627,17 @@
         <w:jc w:val="both"/>
       </w:pPr>
       <w:r>
-        <w:t xml:space="preserve">Muhammad Fachri Ridwan: Conceptualization, Data curation, Methodology, Software, Formal analysis, Writing – original draft. Anthony Halog: Conceptualization, Supervision, Writing – review and editing. To be confirmed by the authors.</w:t>
+        <w:t xml:space="preserve">The database, model, notebook, validation suite and the scripts that generate this manuscript are provided in the MSW_pathway_model_v3 package (build_database_v3.py, msw_pathway_model_v3.py, MSW_pathway_model_v3.ipynb, validate_v3.py). Row-level RIPS source locators are given in input_kota_2025_updated.csv. The package mswpath and the notebook MSW_Decision_Tool_Colab.ipynb let other researchers and planners run the model in Google Colab for their own cities from a one-row-per-city template, re-run the scenario discovery and download Excel/HTML reports in English or Indonesian. A one-city notebook, MSW_Single_City_Colab.ipynb, with an input template in XLSX and CSV form (templates/single_city_template.xlsx), lets readers enter the data of one city by hand, including their own measured parameter values, and reproduces every result of this article for that city; with the example data it reproduces the Kota Padang worked example.</w:t>
       </w:r>
     </w:p>
     <w:bookmarkEnd w:id="57"/>
-    <w:bookmarkStart w:id="58" w:name="Xa6ff8e54395812bd8a1d49fa16c25a1d6a46bbb"/>
+    <w:bookmarkStart w:id="58" w:name="X1a4b0110e6e310c17b3aabed2f99a69911f4168"/>
     <w:p>
       <w:pPr>
         <w:pStyle w:val="Heading2"/>
       </w:pPr>
       <w:r>
-        <w:t xml:space="preserve">Declaration of generative AI in the writing process</w:t>
+        <w:t xml:space="preserve">CRediT authorship contribution statement (draft)</w:t>
       </w:r>
     </w:p>
     <w:p>
@@ -8569,17 +9646,17 @@
         <w:jc w:val="both"/>
       </w:pPr>
       <w:r>
-        <w:t xml:space="preserve">During preparation of this draft the authors used Claude (Anthropic) to restructure the model code, generate the data pipeline and draft text from model outputs. The authors must review and edit the content and take full responsibility for the publication.</w:t>
+        <w:t xml:space="preserve">Muhammad Fachri Ridwan: Conceptualization, Data curation, Methodology, Software, Formal analysis, Writing – original draft. Anthony Halog: Conceptualization, Supervision, Writing – review and editing. To be confirmed by the authors.</w:t>
       </w:r>
     </w:p>
     <w:bookmarkEnd w:id="58"/>
-    <w:bookmarkStart w:id="59" w:name="declaration-of-competing-interest"/>
+    <w:bookmarkStart w:id="59" w:name="Xa6ff8e54395812bd8a1d49fa16c25a1d6a46bbb"/>
     <w:p>
       <w:pPr>
         <w:pStyle w:val="Heading2"/>
       </w:pPr>
       <w:r>
-        <w:t xml:space="preserve">Declaration of competing interest</w:t>
+        <w:t xml:space="preserve">Declaration of generative AI in the writing process</w:t>
       </w:r>
     </w:p>
     <w:p>
@@ -8588,26 +9665,37 @@
         <w:jc w:val="both"/>
       </w:pPr>
       <w:r>
-        <w:t xml:space="preserve">To be completed by the authors.</w:t>
+        <w:t xml:space="preserve">During preparation of this draft the authors used Claude (Anthropic) to restructure the model code, generate the data pipeline and draft text from model outputs. The authors must review and edit the content and take full responsibility for the publication.</w:t>
       </w:r>
     </w:p>
     <w:bookmarkEnd w:id="59"/>
-    <w:bookmarkEnd w:id="60"/>
-    <w:bookmarkStart w:id="61" w:name="references"/>
+    <w:bookmarkStart w:id="60" w:name="declaration-of-competing-interest"/>
     <w:p>
       <w:pPr>
-        <w:pStyle w:val="Heading1"/>
-      </w:pPr>
-      <w:r>
-        <w:t xml:space="preserve">References</w:t>
+        <w:pStyle w:val="Heading2"/>
+      </w:pPr>
+      <w:r>
+        <w:t xml:space="preserve">Declaration of competing interest</w:t>
       </w:r>
     </w:p>
     <w:p>
       <w:pPr>
-        <w:pStyle w:val="Bibliography"/>
-      </w:pPr>
-      <w:r>
-        <w:t xml:space="preserve">Astrup, T.F., Tonini, D., Turconi, R., Boldrin, A., 2015. Life cycle assessment of thermal waste-to-energy technologies: review and recommendations. Waste Manag. 37, 104–115.</w:t>
+        <w:pStyle w:val="FirstParagraph"/>
+        <w:jc w:val="both"/>
+      </w:pPr>
+      <w:r>
+        <w:t xml:space="preserve">To be completed by the authors.</w:t>
+      </w:r>
+    </w:p>
+    <w:bookmarkEnd w:id="60"/>
+    <w:bookmarkEnd w:id="61"/>
+    <w:bookmarkStart w:id="62" w:name="references"/>
+    <w:p>
+      <w:pPr>
+        <w:pStyle w:val="Heading1"/>
+      </w:pPr>
+      <w:r>
+        <w:t xml:space="preserve">References</w:t>
       </w:r>
     </w:p>
     <w:p>
@@ -8615,7 +9703,7 @@
         <w:pStyle w:val="Bibliography"/>
       </w:pPr>
       <w:r>
-        <w:t xml:space="preserve">Azis, M.M., Kristanto, J., Purnomo, C.W., 2021. A techno-economic evaluation of municipal solid waste (MSW) conversion to energy in Indonesia. Sustainability 13, 7232.</w:t>
+        <w:t xml:space="preserve">Astrup, T.F., Tonini, D., Turconi, R., Boldrin, A., 2015. Life cycle assessment of thermal waste-to-energy technologies: review and recommendations. Waste Manag. 37, 104–115.</w:t>
       </w:r>
     </w:p>
     <w:p>
@@ -8623,7 +9711,7 @@
         <w:pStyle w:val="Bibliography"/>
       </w:pPr>
       <w:r>
-        <w:t xml:space="preserve">Bisinella, V., Götze, R., Conradsen, K., Damgaard, A., Christensen, T.H., Astrup, T.F., 2017. Importance of waste composition for life cycle assessment of waste management solutions. J. Clean. Prod. 164, 1180–1191.</w:t>
+        <w:t xml:space="preserve">Azis, M.M., Kristanto, J., Purnomo, C.W., 2021. A techno-economic evaluation of municipal solid waste (MSW) conversion to energy in Indonesia. Sustainability 13, 7232.</w:t>
       </w:r>
     </w:p>
     <w:p>
@@ -8631,7 +9719,7 @@
         <w:pStyle w:val="Bibliography"/>
       </w:pPr>
       <w:r>
-        <w:t xml:space="preserve">Clavreul, J., Guyonnet, D., Christensen, T.H., 2012. Quantifying uncertainty in LCA-modelling of waste management systems. Waste Manag. 32, 2482–2495.</w:t>
+        <w:t xml:space="preserve">Bisinella, V., Götze, R., Conradsen, K., Damgaard, A., Christensen, T.H., Astrup, T.F., 2017. Importance of waste composition for life cycle assessment of waste management solutions. J. Clean. Prod. 164, 1180–1191.</w:t>
       </w:r>
     </w:p>
     <w:p>
@@ -8639,7 +9727,7 @@
         <w:pStyle w:val="Bibliography"/>
       </w:pPr>
       <w:r>
-        <w:t xml:space="preserve">Edjabou, M.E., Jensen, M.B., Götze, R., Pivnenko, K., Petersen, C., Scheutz, C., Astrup, T.F., 2015. Municipal solid waste composition: sampling methodology, statistical analyses, and case study evaluation. Waste Manag. 36, 12–23. https://doi.org/10.1016/j.wasman.2014.11.009</w:t>
+        <w:t xml:space="preserve">Clavreul, J., Guyonnet, D., Christensen, T.H., 2012. Quantifying uncertainty in LCA-modelling of waste management systems. Waste Manag. 32, 2482–2495.</w:t>
       </w:r>
     </w:p>
     <w:p>
@@ -8647,7 +9735,7 @@
         <w:pStyle w:val="Bibliography"/>
       </w:pPr>
       <w:r>
-        <w:t xml:space="preserve">Edjabou, M.E., Martín-Fernández, J.A., Scheutz, C., Astrup, T.F., 2017. Statistical analysis of solid waste composition data: arithmetic mean, standard deviation and correlation coefficients. Waste Manag. 69, 13–23.</w:t>
+        <w:t xml:space="preserve">Edjabou, M.E., Jensen, M.B., Götze, R., Pivnenko, K., Petersen, C., Scheutz, C., Astrup, T.F., 2015. Municipal solid waste composition: sampling methodology, statistical analyses, and case study evaluation. Waste Manag. 36, 12–23. https://doi.org/10.1016/j.wasman.2014.11.009</w:t>
       </w:r>
     </w:p>
     <w:p>
@@ -8655,7 +9743,7 @@
         <w:pStyle w:val="Bibliography"/>
       </w:pPr>
       <w:r>
-        <w:t xml:space="preserve">Götze, R., Boldrin, A., Scheutz, C., Astrup, T.F., 2016. Physico-chemical characterisation of material fractions in household waste: overview of data in literature. Waste Manag. 49, 3–14. https://doi.org/10.1016/j.wasman.2016.01.008</w:t>
+        <w:t xml:space="preserve">Edjabou, M.E., Martín-Fernández, J.A., Scheutz, C., Astrup, T.F., 2017. Statistical analysis of solid waste composition data: arithmetic mean, standard deviation and correlation coefficients. Waste Manag. 69, 13–23.</w:t>
       </w:r>
     </w:p>
     <w:p>
@@ -8663,7 +9751,7 @@
         <w:pStyle w:val="Bibliography"/>
       </w:pPr>
       <w:r>
-        <w:t xml:space="preserve">IPCC, 2006. 2006 IPCC Guidelines for National Greenhouse Gas Inventories, Vol. 5 Waste. IGES, Hayama.</w:t>
+        <w:t xml:space="preserve">Götze, R., Boldrin, A., Scheutz, C., Astrup, T.F., 2016. Physico-chemical characterisation of material fractions in household waste: overview of data in literature. Waste Manag. 49, 3–14. https://doi.org/10.1016/j.wasman.2016.01.008</w:t>
       </w:r>
     </w:p>
     <w:p>
@@ -8671,7 +9759,7 @@
         <w:pStyle w:val="Bibliography"/>
       </w:pPr>
       <w:r>
-        <w:t xml:space="preserve">IPCC, 2019. 2019 Refinement to the 2006 IPCC Guidelines for National Greenhouse Gas Inventories, Vol. 5, Ch. 3. IPCC, Switzerland.</w:t>
+        <w:t xml:space="preserve">IPCC, 2006. 2006 IPCC Guidelines for National Greenhouse Gas Inventories, Vol. 5 Waste. IGES, Hayama.</w:t>
       </w:r>
     </w:p>
     <w:p>
@@ -8679,7 +9767,7 @@
         <w:pStyle w:val="Bibliography"/>
       </w:pPr>
       <w:r>
-        <w:t xml:space="preserve">IPCC, 2021. Climate Change 2021: The Physical Science Basis. Contribution of Working Group I to the Sixth Assessment Report. Cambridge University Press.</w:t>
+        <w:t xml:space="preserve">IPCC, 2019. 2019 Refinement to the 2006 IPCC Guidelines for National Greenhouse Gas Inventories, Vol. 5, Ch. 3. IPCC, Switzerland.</w:t>
       </w:r>
     </w:p>
     <w:p>
@@ -8687,7 +9775,7 @@
         <w:pStyle w:val="Bibliography"/>
       </w:pPr>
       <w:r>
-        <w:t xml:space="preserve">ISO, 2006. ISO 14040 and ISO 14044: Environmental management – Life cycle assessment. International Organization for Standardization, Geneva.</w:t>
+        <w:t xml:space="preserve">IPCC, 2021. Climate Change 2021: The Physical Science Basis. Contribution of Working Group I to the Sixth Assessment Report. Cambridge University Press.</w:t>
       </w:r>
     </w:p>
     <w:p>
@@ -8695,7 +9783,7 @@
         <w:pStyle w:val="Bibliography"/>
       </w:pPr>
       <w:r>
-        <w:t xml:space="preserve">Khandelwal, H., Dhar, H., Thalla, A.K., Kumar, S., 2019. Application of life cycle assessment in municipal solid waste management: a worldwide critical review. J. Clean. Prod. 209, 630–654.</w:t>
+        <w:t xml:space="preserve">ISO, 2006. ISO 14040 and ISO 14044: Environmental management – Life cycle assessment. International Organization for Standardization, Geneva.</w:t>
       </w:r>
     </w:p>
     <w:p>
@@ -8703,7 +9791,7 @@
         <w:pStyle w:val="Bibliography"/>
       </w:pPr>
       <w:r>
-        <w:t xml:space="preserve">Lahdelma, R., Salminen, P., 2001. SMAA-2: stochastic multicriteria acceptability analysis for group decision making. Oper. Res. 49, 444–454.</w:t>
+        <w:t xml:space="preserve">Khandelwal, H., Dhar, H., Thalla, A.K., Kumar, S., 2019. Application of life cycle assessment in municipal solid waste management: a worldwide critical review. J. Clean. Prod. 209, 630–654.</w:t>
       </w:r>
     </w:p>
     <w:p>
@@ -8711,7 +9799,7 @@
         <w:pStyle w:val="Bibliography"/>
       </w:pPr>
       <w:r>
-        <w:t xml:space="preserve">Laurent, A., Bakas, I., Clavreul, J., et al., 2014. Review of LCA studies of solid waste management systems – Part I: lessons learned and perspectives. Waste Manag. 34, 573–588.</w:t>
+        <w:t xml:space="preserve">Lahdelma, R., Salminen, P., 2001. SMAA-2: stochastic multicriteria acceptability analysis for group decision making. Oper. Res. 49, 444–454.</w:t>
       </w:r>
     </w:p>
     <w:p>
@@ -8719,7 +9807,7 @@
         <w:pStyle w:val="Bibliography"/>
       </w:pPr>
       <w:r>
-        <w:t xml:space="preserve">Levett, I., Birkett, G., Davies, N., et al., 2016. Techno-economic assessment of poly-3-hydroxybutyrate (PHB) production from methane – the case for thermophilic bioprocessing. J. Environ. Chem. Eng. 4, 3724–3733.</w:t>
+        <w:t xml:space="preserve">Laurent, A., Bakas, I., Clavreul, J., et al., 2014. Review of LCA studies of solid waste management systems – Part I: lessons learned and perspectives. Waste Manag. 34, 573–588.</w:t>
       </w:r>
     </w:p>
     <w:p>
@@ -8727,7 +9815,7 @@
         <w:pStyle w:val="Bibliography"/>
       </w:pPr>
       <w:r>
-        <w:t xml:space="preserve">Prabowo, B., Simanjuntak, F.S.H., Saldi, Z.S., Samyudia, Y., Widjojo, I.J., 2019. Assessment of waste to energy technology in Indonesia: a techno-economical perspective on a 1000 ton/day scenario. Int. J. Technol. 10, 1228–1234.</w:t>
+        <w:t xml:space="preserve">Levett, I., Birkett, G., Davies, N., et al., 2016. Techno-economic assessment of poly-3-hydroxybutyrate (PHB) production from methane – the case for thermophilic bioprocessing. J. Environ. Chem. Eng. 4, 3724–3733.</w:t>
       </w:r>
     </w:p>
     <w:p>
@@ -8735,7 +9823,7 @@
         <w:pStyle w:val="Bibliography"/>
       </w:pPr>
       <w:r>
-        <w:t xml:space="preserve">Rand, T., Haukohl, J., Marxen, U., 2000. Municipal Solid Waste Incineration: Requirements for a Successful Project. World Bank Technical Paper 462, Washington, DC.</w:t>
+        <w:t xml:space="preserve">Prabowo, B., Simanjuntak, F.S.H., Saldi, Z.S., Samyudia, Y., Widjojo, I.J., 2019. Assessment of waste to energy technology in Indonesia: a techno-economical perspective on a 1000 ton/day scenario. Int. J. Technol. 10, 1228–1234.</w:t>
       </w:r>
     </w:p>
     <w:p>
@@ -8743,7 +9831,7 @@
         <w:pStyle w:val="Bibliography"/>
       </w:pPr>
       <w:r>
-        <w:t xml:space="preserve">Republic of Indonesia, 2021. Undang-Undang No. 7/2021 (carbon tax). Republic of Indonesia, 2025. Peraturan Presiden No. 109/2025 (waste-to-energy).</w:t>
+        <w:t xml:space="preserve">Rand, T., Haukohl, J., Marxen, U., 2000. Municipal Solid Waste Incineration: Requirements for a Successful Project. World Bank Technical Paper 462, Washington, DC.</w:t>
       </w:r>
     </w:p>
     <w:p>
@@ -8751,7 +9839,7 @@
         <w:pStyle w:val="Bibliography"/>
       </w:pPr>
       <w:r>
-        <w:t xml:space="preserve">Saltelli, A., Annoni, P., Azzini, I., Campolongo, F., Ratto, M., Tarantola, S., 2010. Variance based sensitivity analysis of model output. Design and estimator for the total sensitivity index. Comput. Phys. Commun. 181, 259–270.</w:t>
+        <w:t xml:space="preserve">Republic of Indonesia, 2021. Undang-Undang No. 7/2021 (carbon tax). Republic of Indonesia, 2025. Peraturan Presiden No. 109/2025 (waste-to-energy).</w:t>
       </w:r>
     </w:p>
     <w:p>
@@ -8759,7 +9847,7 @@
         <w:pStyle w:val="Bibliography"/>
       </w:pPr>
       <w:r>
-        <w:t xml:space="preserve">Basinas, P., et al., 2020. Assessment of high-solid mesophilic and thermophilic anaerobic digestion of mechanically-separated municipal solid waste. Environ. Res.</w:t>
+        <w:t xml:space="preserve">Saltelli, A., Annoni, P., Azzini, I., Campolongo, F., Ratto, M., Tarantola, S., 2010. Variance based sensitivity analysis of model output. Design and estimator for the total sensitivity index. Comput. Phys. Commun. 181, 259–270.</w:t>
       </w:r>
     </w:p>
     <w:p>
@@ -8767,7 +9855,7 @@
         <w:pStyle w:val="Bibliography"/>
       </w:pPr>
       <w:r>
-        <w:t xml:space="preserve">Basinas, P., et al., 2021. Dry anaerobic digestion of the fine particle fraction of mechanically-sorted organic fraction of municipal solid waste in laboratory and pilot reactor. Waste Manag.</w:t>
+        <w:t xml:space="preserve">Basinas, P., et al., 2020. Assessment of high-solid mesophilic and thermophilic anaerobic digestion of mechanically-separated municipal solid waste. Environ. Res.</w:t>
       </w:r>
     </w:p>
     <w:p>
@@ -8775,7 +9863,7 @@
         <w:pStyle w:val="Bibliography"/>
       </w:pPr>
       <w:r>
-        <w:t xml:space="preserve">ESDM (Ministry of Energy and Mineral Resources), 2018. Grid emission factors of the Indonesian electricity systems (as listed for the Joint Crediting Mechanism, GEC).</w:t>
+        <w:t xml:space="preserve">Basinas, P., et al., 2021. Dry anaerobic digestion of the fine particle fraction of mechanically-sorted organic fraction of municipal solid waste in laboratory and pilot reactor. Waste Manag.</w:t>
       </w:r>
     </w:p>
     <w:p>
@@ -8783,7 +9871,7 @@
         <w:pStyle w:val="Bibliography"/>
       </w:pPr>
       <w:r>
-        <w:t xml:space="preserve">Seruga, P., et al., 2020. Anaerobic digestion performance: separate collected vs. mechanical segregated organic fractions of municipal solid waste as feedstock. Energies 13.</w:t>
+        <w:t xml:space="preserve">ESDM (Ministry of Energy and Mineral Resources), 2018. Grid emission factors of the Indonesian electricity systems (as listed for the Joint Crediting Mechanism, GEC).</w:t>
       </w:r>
     </w:p>
     <w:p>
@@ -8791,7 +9879,7 @@
         <w:pStyle w:val="Bibliography"/>
       </w:pPr>
       <w:r>
-        <w:t xml:space="preserve">Strong, M., Oakley, J.E., Brennan, A., 2014. Estimating multiparameter partial expected value of perfect information from a probabilistic sensitivity analysis sample: a nonparametric regression approach. Med. Decis. Making 34, 311–326.</w:t>
+        <w:t xml:space="preserve">Seruga, P., et al., 2020. Anaerobic digestion performance: separate collected vs. mechanical segregated organic fractions of municipal solid waste as feedstock. Energies 13.</w:t>
       </w:r>
     </w:p>
     <w:p>
@@ -8799,7 +9887,7 @@
         <w:pStyle w:val="Bibliography"/>
       </w:pPr>
       <w:r>
-        <w:t xml:space="preserve">Yuliani, M., et al., 2022. Kajian tekno-ekonomi penerapan insinerator waste-to-energy di Indonesia (kasus pada Kota X). J. Teknol. Lingkung.</w:t>
+        <w:t xml:space="preserve">Strong, M., Oakley, J.E., Brennan, A., 2014. Estimating multiparameter partial expected value of perfect information from a probabilistic sensitivity analysis sample: a nonparametric regression approach. Med. Decis. Making 34, 311–326.</w:t>
       </w:r>
     </w:p>
     <w:p>
@@ -8807,7 +9895,7 @@
         <w:pStyle w:val="Bibliography"/>
       </w:pPr>
       <w:r>
-        <w:t xml:space="preserve">Zhang, R., El-Mashad, H.M., Hartman, K., et al., 2007. Characterization of food waste as feedstock for anaerobic digestion. Bioresour. Technol. 98, 929–935.</w:t>
+        <w:t xml:space="preserve">Yuliani, M., et al., 2022. Kajian tekno-ekonomi penerapan insinerator waste-to-energy di Indonesia (kasus pada Kota X). J. Teknol. Lingkung.</w:t>
       </w:r>
     </w:p>
     <w:p>
@@ -8815,7 +9903,7 @@
         <w:pStyle w:val="Bibliography"/>
       </w:pPr>
       <w:r>
-        <w:t xml:space="preserve">Breiman, L., Friedman, J.H., Olshen, R.A., Stone, C.J., 1984. Classification and Regression Trees. Wadsworth, Belmont, CA.</w:t>
+        <w:t xml:space="preserve">Zhang, R., El-Mashad, H.M., Hartman, K., et al., 2007. Characterization of food waste as feedstock for anaerobic digestion. Bioresour. Technol. 98, 929–935.</w:t>
       </w:r>
     </w:p>
     <w:p>
@@ -8823,7 +9911,7 @@
         <w:pStyle w:val="Bibliography"/>
       </w:pPr>
       <w:r>
-        <w:t xml:space="preserve">Friedman, J.H., Fisher, N.I., 1999. Bump hunting in high-dimensional data. Stat. Comput. 9, 123–143.</w:t>
+        <w:t xml:space="preserve">Breiman, L., Friedman, J.H., Olshen, R.A., Stone, C.J., 1984. Classification and Regression Trees. Wadsworth, Belmont, CA.</w:t>
       </w:r>
     </w:p>
     <w:p>
@@ -8831,16 +9919,24 @@
         <w:pStyle w:val="Bibliography"/>
       </w:pPr>
       <w:r>
-        <w:t xml:space="preserve">Frischknecht, R., Wyss, F., Büsser Knöpfel, S., Lützkendorf, T., Balouktsi, M., 2015. Cumulative energy demand in LCA: the energy harvested approach. Int. J. Life Cycle Assess. 20, 957–969.</w:t>
+        <w:t xml:space="preserve">Friedman, J.H., Fisher, N.I., 1999. Bump hunting in high-dimensional data. Stat. Comput. 9, 123–143.</w:t>
       </w:r>
     </w:p>
     <w:p>
+      <w:pPr>
+        <w:pStyle w:val="Bibliography"/>
+      </w:pPr>
+      <w:r>
+        <w:t xml:space="preserve">Frischknecht, R., Wyss, F., Büsser Knöpfel, S., Lützkendorf, T., Balouktsi, M., 2015. Cumulative energy demand in LCA: the energy harvested approach. Int. J. Life Cycle Assess. 20, 957–969.</w:t>
+      </w:r>
+    </w:p>
+    <w:p>
       <w:r>
         <w:br w:type="page"/>
       </w:r>
     </w:p>
-    <w:bookmarkEnd w:id="61"/>
-    <w:bookmarkStart w:id="66" w:name="supplementary-material"/>
+    <w:bookmarkEnd w:id="62"/>
+    <w:bookmarkStart w:id="67" w:name="supplementary-material"/>
     <w:p>
       <w:pPr>
         <w:pStyle w:val="Heading1"/>
@@ -8849,7 +9945,7 @@
         <w:t xml:space="preserve">Supplementary material</w:t>
       </w:r>
     </w:p>
-    <w:bookmarkStart w:id="65" w:name="Xfd44a651fa68d6f0b64b52b618f6cb079d98dfd"/>
+    <w:bookmarkStart w:id="66" w:name="Xfd44a651fa68d6f0b64b52b618f6cb079d98dfd"/>
     <w:p>
       <w:pPr>
         <w:pStyle w:val="Heading2"/>
@@ -12956,18 +14052,18 @@
           <wp:inline>
             <wp:extent cx="5579999" cy="2360769"/>
             <wp:effectExtent b="0" l="0" r="0" t="0"/>
-            <wp:docPr descr="Fig. S1. Mean absolute Spearman rank correlation between inputs and results over the 21 locations." title="" id="63" name="Picture"/>
+            <wp:docPr descr="Fig. S1. Mean absolute Spearman rank correlation between inputs and results over the 21 locations." title="" id="64" name="Picture"/>
             <a:graphic>
               <a:graphicData uri="http://schemas.openxmlformats.org/drawingml/2006/picture">
                 <pic:pic>
                   <pic:nvPicPr>
-                    <pic:cNvPr descr="/home/user/claude/MSW_pathway_model_v3/outputs/fig_sensitivity.png" id="64" name="Picture"/>
+                    <pic:cNvPr descr="/home/user/claude/MSW_pathway_model_v3/outputs/fig_sensitivity.png" id="65" name="Picture"/>
                     <pic:cNvPicPr>
                       <a:picLocks noChangeArrowheads="1" noChangeAspect="1"/>
                     </pic:cNvPicPr>
                   </pic:nvPicPr>
                   <pic:blipFill>
-                    <a:blip r:embed="rId62"/>
+                    <a:blip r:embed="rId63"/>
                     <a:stretch>
                       <a:fillRect/>
                     </a:stretch>
@@ -13002,8 +14098,8 @@
         <w:t xml:space="preserve">Fig. S1. Mean absolute Spearman rank correlation between inputs and results over the 21 locations.</w:t>
       </w:r>
     </w:p>
-    <w:bookmarkEnd w:id="65"/>
     <w:bookmarkEnd w:id="66"/>
+    <w:bookmarkEnd w:id="67"/>
     <w:sectPr>
       <w:footnotePr>
         <w:numRestart w:val="eachSect"/>

</xml_diff>